<commit_message>
Refine UML diagram layout and polish use-case flow document
</commit_message>
<xml_diff>
--- a/Use_Case_Flow.docx
+++ b/Use_Case_Flow.docx
@@ -43,7 +43,7 @@
     <w:p/>
     <w:p>
       <w:pPr>
-        <w:spacing w:before="120" w:after="40"/>
+        <w:spacing w:before="160" w:after="60"/>
       </w:pPr>
       <w:r>
         <w:rPr>
@@ -110,7 +110,7 @@
     <w:p/>
     <w:p>
       <w:pPr>
-        <w:spacing w:before="120" w:after="40"/>
+        <w:spacing w:before="160" w:after="60"/>
       </w:pPr>
       <w:r>
         <w:rPr>
@@ -141,7 +141,7 @@
         <w:rPr>
           <w:sz w:val="20"/>
         </w:rPr>
-        <w:t>The requested equipment item exists in the system inventory.</w:t>
+        <w:t>The requested equipment item exists in the inventory.</w:t>
       </w:r>
     </w:p>
     <w:p>
@@ -171,7 +171,7 @@
     <w:p/>
     <w:p>
       <w:pPr>
-        <w:spacing w:before="120" w:after="40"/>
+        <w:spacing w:before="160" w:after="60"/>
       </w:pPr>
       <w:r>
         <w:rPr>
@@ -202,7 +202,7 @@
         <w:rPr>
           <w:sz w:val="20"/>
         </w:rPr>
-        <w:t>2. The system retrieves and displays matching equipment items along with their current availability status.</w:t>
+        <w:t>2. The system displays matching equipment items with current availability status.</w:t>
       </w:r>
     </w:p>
     <w:p>
@@ -214,7 +214,7 @@
         <w:rPr>
           <w:sz w:val="20"/>
         </w:rPr>
-        <w:t>3. The Community Member selects an available equipment item to borrow.</w:t>
+        <w:t>3. The Community Member selects an available item to borrow.</w:t>
       </w:r>
     </w:p>
     <w:p>
@@ -286,7 +286,7 @@
         <w:rPr>
           <w:sz w:val="20"/>
         </w:rPr>
-        <w:t>9. The system creates a loan record associating the member, equipment item, deposit, and return date.</w:t>
+        <w:t>9. The system creates a loan record with the member, equipment item, deposit, and return date.</w:t>
       </w:r>
     </w:p>
     <w:p>
@@ -322,13 +322,13 @@
         <w:rPr>
           <w:sz w:val="20"/>
         </w:rPr>
-        <w:t>12. The system displays a borrowing confirmation to the Community Member with all loan details.</w:t>
+        <w:t>12. The system displays a borrowing confirmation to the Community Member.</w:t>
       </w:r>
     </w:p>
     <w:p/>
     <w:p>
       <w:pPr>
-        <w:spacing w:before="120" w:after="40"/>
+        <w:spacing w:before="160" w:after="60"/>
       </w:pPr>
       <w:r>
         <w:rPr>
@@ -340,7 +340,7 @@
     </w:p>
     <w:p>
       <w:pPr>
-        <w:spacing w:before="40"/>
+        <w:spacing w:before="60" w:after="40"/>
       </w:pPr>
       <w:r>
         <w:rPr>
@@ -414,7 +414,7 @@
     <w:p/>
     <w:p>
       <w:pPr>
-        <w:spacing w:before="40"/>
+        <w:spacing w:before="60" w:after="40"/>
       </w:pPr>
       <w:r>
         <w:rPr>
@@ -434,7 +434,7 @@
         <w:rPr>
           <w:sz w:val="20"/>
         </w:rPr>
-        <w:t>At step 3, the system detects that the selected item is no longer available (checked out by another member between search and selection).</w:t>
+        <w:t>At step 3, the system detects that the selected item is no longer available.</w:t>
       </w:r>
     </w:p>
     <w:p>
@@ -446,7 +446,7 @@
         <w:rPr>
           <w:sz w:val="20"/>
         </w:rPr>
-        <w:t>3a. The system informs the Community Member that the selected item is no longer available.</w:t>
+        <w:t>3a. The system informs the Community Member that the item is no longer available.</w:t>
       </w:r>
     </w:p>
     <w:p>
@@ -458,7 +458,7 @@
         <w:rPr>
           <w:sz w:val="20"/>
         </w:rPr>
-        <w:t>3b. The system displays the current availability status and suggests alternative items if available.</w:t>
+        <w:t>3b. The system displays current availability and suggests alternatives if available.</w:t>
       </w:r>
     </w:p>
     <w:p>
@@ -476,7 +476,7 @@
     <w:p/>
     <w:p>
       <w:pPr>
-        <w:spacing w:before="120" w:after="40"/>
+        <w:spacing w:before="160" w:after="60"/>
       </w:pPr>
       <w:r>
         <w:rPr>
@@ -488,7 +488,7 @@
     </w:p>
     <w:p>
       <w:pPr>
-        <w:spacing w:before="40"/>
+        <w:spacing w:before="60" w:after="40"/>
       </w:pPr>
       <w:r>
         <w:rPr>
@@ -508,7 +508,7 @@
         <w:rPr>
           <w:sz w:val="20"/>
         </w:rPr>
-        <w:t>A loan record exists in the system associating the member, equipment item, deposit amount, and return date.</w:t>
+        <w:t>A loan record exists associating the member, equipment item, deposit amount, and return date.</w:t>
       </w:r>
     </w:p>
     <w:p>
@@ -550,7 +550,7 @@
     <w:p/>
     <w:p>
       <w:pPr>
-        <w:spacing w:before="40"/>
+        <w:spacing w:before="60" w:after="40"/>
       </w:pPr>
       <w:r>
         <w:rPr>

</xml_diff>

<commit_message>
Refine Lab 1 UML and use-case flow
</commit_message>
<xml_diff>
--- a/Use_Case_Flow.docx
+++ b/Use_Case_Flow.docx
@@ -9,7 +9,7 @@
       <w:r>
         <w:rPr>
           <w:b/>
-          <w:sz w:val="32"/>
+          <w:sz w:val="30"/>
         </w:rPr>
         <w:t>Use-Case Flow Specification</w:t>
       </w:r>
@@ -40,10 +40,14 @@
         <w:t>Name: Rohit R  |  SRN: PES2UG24AM137  |  Section: AIML-B</w:t>
       </w:r>
     </w:p>
-    <w:p/>
     <w:p>
       <w:pPr>
-        <w:spacing w:before="160" w:after="60"/>
+        <w:spacing w:after="80"/>
+      </w:pPr>
+    </w:p>
+    <w:p>
+      <w:pPr>
+        <w:spacing w:before="120" w:after="40"/>
       </w:pPr>
       <w:r>
         <w:rPr>
@@ -107,10 +111,14 @@
         <w:t>Library Custodian, Depot Locker System</w:t>
       </w:r>
     </w:p>
-    <w:p/>
     <w:p>
       <w:pPr>
-        <w:spacing w:before="160" w:after="60"/>
+        <w:spacing w:after="40"/>
+      </w:pPr>
+    </w:p>
+    <w:p>
+      <w:pPr>
+        <w:spacing w:before="120" w:after="40"/>
       </w:pPr>
       <w:r>
         <w:rPr>
@@ -129,7 +137,7 @@
         <w:rPr>
           <w:sz w:val="20"/>
         </w:rPr>
-        <w:t>The Community Member has a valid, authenticated account in the system.</w:t>
+        <w:t>The Community Member has a valid, authenticated account.</w:t>
       </w:r>
     </w:p>
     <w:p>
@@ -153,25 +161,17 @@
         <w:rPr>
           <w:sz w:val="20"/>
         </w:rPr>
-        <w:t>The requested equipment item is currently available (not checked out).</w:t>
+        <w:t>The requested equipment item is currently available.</w:t>
       </w:r>
     </w:p>
     <w:p>
       <w:pPr>
-        <w:pStyle w:val="ListBullet"/>
-        <w:spacing w:before="20" w:after="20"/>
+        <w:spacing w:after="40"/>
       </w:pPr>
-      <w:r>
-        <w:rPr>
-          <w:sz w:val="20"/>
-        </w:rPr>
-        <w:t>The Community Member is not prohibited from borrowing (no overdue items or account restrictions).</w:t>
-      </w:r>
     </w:p>
-    <w:p/>
     <w:p>
       <w:pPr>
-        <w:spacing w:before="160" w:after="60"/>
+        <w:spacing w:before="120" w:after="40"/>
       </w:pPr>
       <w:r>
         <w:rPr>
@@ -226,7 +226,7 @@
         <w:rPr>
           <w:sz w:val="20"/>
         </w:rPr>
-        <w:t>4. The system verifies the member's borrowing eligibility (account status, overdue items, borrowing limits).</w:t>
+        <w:t>4. The system verifies the member's borrowing eligibility.</w:t>
       </w:r>
     </w:p>
     <w:p>
@@ -238,7 +238,7 @@
         <w:rPr>
           <w:sz w:val="20"/>
         </w:rPr>
-        <w:t>5. The system checks the applicable loan duration limits for the selected equipment category.</w:t>
+        <w:t>5. The system checks the applicable loan duration limits for the equipment category.</w:t>
       </w:r>
     </w:p>
     <w:p>
@@ -262,7 +262,7 @@
         <w:rPr>
           <w:sz w:val="20"/>
         </w:rPr>
-        <w:t>7. The system displays the deposit amount, loan duration, and expected return date to the member.</w:t>
+        <w:t>7. The system displays the deposit amount, loan duration, and expected return date.</w:t>
       </w:r>
     </w:p>
     <w:p>
@@ -286,7 +286,7 @@
         <w:rPr>
           <w:sz w:val="20"/>
         </w:rPr>
-        <w:t>9. The system creates a loan record with the member, equipment item, deposit, and return date.</w:t>
+        <w:t>9. The system creates a loan record with the member, equipment, deposit, and return date.</w:t>
       </w:r>
     </w:p>
     <w:p>
@@ -310,7 +310,7 @@
         <w:rPr>
           <w:sz w:val="20"/>
         </w:rPr>
-        <w:t>11. The Depot Locker System updates the physical availability indicator at the corresponding locker.</w:t>
+        <w:t>11. The Depot Locker System updates the physical availability indicator.</w:t>
       </w:r>
     </w:p>
     <w:p>
@@ -325,10 +325,14 @@
         <w:t>12. The system displays a borrowing confirmation to the Community Member.</w:t>
       </w:r>
     </w:p>
-    <w:p/>
     <w:p>
       <w:pPr>
-        <w:spacing w:before="160" w:after="60"/>
+        <w:spacing w:after="40"/>
+      </w:pPr>
+    </w:p>
+    <w:p>
+      <w:pPr>
+        <w:spacing w:before="120" w:after="40"/>
       </w:pPr>
       <w:r>
         <w:rPr>
@@ -340,7 +344,7 @@
     </w:p>
     <w:p>
       <w:pPr>
-        <w:spacing w:before="60" w:after="40"/>
+        <w:spacing w:before="80" w:after="40"/>
       </w:pPr>
       <w:r>
         <w:rPr>
@@ -384,7 +388,7 @@
         <w:rPr>
           <w:sz w:val="20"/>
         </w:rPr>
-        <w:t>4b. The system displays the details of the overdue item and the associated restriction.</w:t>
+        <w:t>4b. The system displays the overdue item and borrowing restriction.</w:t>
       </w:r>
     </w:p>
     <w:p>
@@ -396,7 +400,7 @@
         <w:rPr>
           <w:sz w:val="20"/>
         </w:rPr>
-        <w:t>4c. The system informs the member that borrowing cannot continue until the overdue item is returned and any applicable fees are settled.</w:t>
+        <w:t>4c. The system informs the member that borrowing cannot continue until the restriction is resolved.</w:t>
       </w:r>
     </w:p>
     <w:p>
@@ -411,72 +415,14 @@
         <w:t>4d. The use case ends without creating a new loan record.</w:t>
       </w:r>
     </w:p>
-    <w:p/>
     <w:p>
       <w:pPr>
-        <w:spacing w:before="60" w:after="40"/>
+        <w:spacing w:after="40"/>
       </w:pPr>
-      <w:r>
-        <w:rPr>
-          <w:b/>
-          <w:i/>
-          <w:sz w:val="20"/>
-        </w:rPr>
-        <w:t>A2 — Equipment Becomes Unavailable</w:t>
-      </w:r>
     </w:p>
     <w:p>
       <w:pPr>
-        <w:spacing w:before="20" w:after="20"/>
-        <w:ind w:left="720"/>
-      </w:pPr>
-      <w:r>
-        <w:rPr>
-          <w:sz w:val="20"/>
-        </w:rPr>
-        <w:t>At step 3, the system detects that the selected item is no longer available.</w:t>
-      </w:r>
-    </w:p>
-    <w:p>
-      <w:pPr>
-        <w:spacing w:before="20" w:after="20"/>
-        <w:ind w:left="720"/>
-      </w:pPr>
-      <w:r>
-        <w:rPr>
-          <w:sz w:val="20"/>
-        </w:rPr>
-        <w:t>3a. The system informs the Community Member that the item is no longer available.</w:t>
-      </w:r>
-    </w:p>
-    <w:p>
-      <w:pPr>
-        <w:spacing w:before="20" w:after="20"/>
-        <w:ind w:left="720"/>
-      </w:pPr>
-      <w:r>
-        <w:rPr>
-          <w:sz w:val="20"/>
-        </w:rPr>
-        <w:t>3b. The system displays current availability and suggests alternatives if available.</w:t>
-      </w:r>
-    </w:p>
-    <w:p>
-      <w:pPr>
-        <w:spacing w:before="20" w:after="20"/>
-        <w:ind w:left="720"/>
-      </w:pPr>
-      <w:r>
-        <w:rPr>
-          <w:sz w:val="20"/>
-        </w:rPr>
-        <w:t>3c. The Community Member may select another item (return to step 3) or end the use case.</w:t>
-      </w:r>
-    </w:p>
-    <w:p/>
-    <w:p>
-      <w:pPr>
-        <w:spacing w:before="160" w:after="60"/>
+        <w:spacing w:before="120" w:after="40"/>
       </w:pPr>
       <w:r>
         <w:rPr>
@@ -488,7 +434,7 @@
     </w:p>
     <w:p>
       <w:pPr>
-        <w:spacing w:before="60" w:after="40"/>
+        <w:spacing w:before="80" w:after="40"/>
       </w:pPr>
       <w:r>
         <w:rPr>
@@ -508,7 +454,7 @@
         <w:rPr>
           <w:sz w:val="20"/>
         </w:rPr>
-        <w:t>A loan record exists associating the member, equipment item, deposit amount, and return date.</w:t>
+        <w:t>A loan record exists associating the member, equipment, deposit, and return date.</w:t>
       </w:r>
     </w:p>
     <w:p>
@@ -520,7 +466,7 @@
         <w:rPr>
           <w:sz w:val="20"/>
         </w:rPr>
-        <w:t>The equipment item status is updated to "Checked Out" in the inventory.</w:t>
+        <w:t>The equipment status is updated to "Checked Out" in the inventory.</w:t>
       </w:r>
     </w:p>
     <w:p>
@@ -547,10 +493,14 @@
         <w:t>The physical availability indicator at the Depot Locker is updated.</w:t>
       </w:r>
     </w:p>
-    <w:p/>
     <w:p>
       <w:pPr>
-        <w:spacing w:before="60" w:after="40"/>
+        <w:spacing w:after="20"/>
+      </w:pPr>
+    </w:p>
+    <w:p>
+      <w:pPr>
+        <w:spacing w:before="80" w:after="40"/>
       </w:pPr>
       <w:r>
         <w:rPr>
@@ -594,12 +544,12 @@
         <w:rPr>
           <w:sz w:val="20"/>
         </w:rPr>
-        <w:t>The member is notified of the restriction and required resolution steps.</w:t>
+        <w:t>The member is notified of the restriction.</w:t>
       </w:r>
     </w:p>
     <w:sectPr>
       <w:pgSz w:w="12240" w:h="15840"/>
-      <w:pgMar w:top="1152" w:right="1440" w:bottom="1008" w:left="1440" w:header="720" w:footer="720" w:gutter="0"/>
+      <w:pgMar w:top="1008" w:right="1296" w:bottom="864" w:left="1296" w:header="720" w:footer="720" w:gutter="0"/>
       <w:cols w:space="720"/>
       <w:docGrid w:linePitch="360"/>
     </w:sectPr>
@@ -971,7 +921,7 @@
     <w:qFormat/>
     <w:rsid w:val="00FC693F"/>
     <w:pPr>
-      <w:spacing w:after="40" w:before="0"/>
+      <w:spacing w:after="40" w:before="0" w:line="240" w:lineRule="auto"/>
     </w:pPr>
     <w:rPr>
       <w:rFonts w:ascii="Calibri" w:hAnsi="Calibri"/>

</xml_diff>